<commit_message>
refatorado para usar enum em apiexception. projeto quebrado ainda
</commit_message>
<xml_diff>
--- a/meu prompt de verificacao.docx
+++ b/meu prompt de verificacao.docx
@@ -1713,6 +1713,9 @@
         <w:t>/Manager” só quando realmente necessário</w:t>
       </w:r>
     </w:p>
+    <w:p/>
+    <w:p/>
+    <w:p/>
     <w:p/>
     <w:p/>
     <w:p/>
@@ -6734,6 +6737,7 @@
   <w:style w:type="character" w:default="1" w:styleId="Fontepargpadro">
     <w:name w:val="Default Paragraph Font"/>
     <w:uiPriority w:val="1"/>
+    <w:semiHidden/>
     <w:unhideWhenUsed/>
   </w:style>
   <w:style w:type="table" w:default="1" w:styleId="Tabelanormal">

</xml_diff>

<commit_message>
WIP: estado quebrado antes de rollback (55 classes)
</commit_message>
<xml_diff>
--- a/meu prompt de verificacao.docx
+++ b/meu prompt de verificacao.docx
@@ -4,7 +4,13 @@
   <w:body>
     <w:p>
       <w:r>
-        <w:t>Faça assim: o novo .zip vira automaticamente a única fonte de verdade; ignore todos os anteriores</w:t>
+        <w:t xml:space="preserve">Faça assim: o </w:t>
+      </w:r>
+      <w:r>
+        <w:t>anexo mais recente</w:t>
+      </w:r>
+      <w:r>
+        <w:t xml:space="preserve"> vira automaticamente a única fonte de verdade; ignore todos os anteriores</w:t>
       </w:r>
     </w:p>
     <w:p>

</xml_diff>

<commit_message>
refatoracao de planos x pagamentos
</commit_message>
<xml_diff>
--- a/meu prompt de verificacao.docx
+++ b/meu prompt de verificacao.docx
@@ -4,7 +4,22 @@
   <w:body>
     <w:p>
       <w:r>
-        <w:t>Faça assim: o novo .zip vira automaticamente a única fonte de verdade; ignore todos os anteriores</w:t>
+        <w:t>Faça assim: o novo</w:t>
+      </w:r>
+      <w:r>
+        <w:t xml:space="preserve"> arquivo em anexo que eu envio</w:t>
+      </w:r>
+      <w:r>
+        <w:t xml:space="preserve"> vira automaticamente a única fonte de verdade</w:t>
+      </w:r>
+      <w:r>
+        <w:t xml:space="preserve"> (é o código fonte completo mais atual)</w:t>
+      </w:r>
+      <w:r>
+        <w:t xml:space="preserve">; </w:t>
+      </w:r>
+      <w:r>
+        <w:t>considere somente ele</w:t>
       </w:r>
     </w:p>
     <w:p>
@@ -116,7 +131,13 @@
       </w:r>
       <w:proofErr w:type="spellEnd"/>
       <w:r>
-        <w:t xml:space="preserve"> de código e sim o código completo no contexto da classe.</w:t>
+        <w:t xml:space="preserve"> de código e sim</w:t>
+      </w:r>
+      <w:r>
+        <w:t xml:space="preserve"> sempre</w:t>
+      </w:r>
+      <w:r>
+        <w:t xml:space="preserve"> o código completo no contexto da classe.</w:t>
       </w:r>
       <w:r>
         <w:t xml:space="preserve"> Sempre com </w:t>
@@ -126,6 +147,9 @@
         <w:t>javadoc</w:t>
       </w:r>
       <w:proofErr w:type="spellEnd"/>
+      <w:r>
+        <w:t xml:space="preserve"> e logs</w:t>
+      </w:r>
     </w:p>
     <w:p>
       <w:r>

</xml_diff>

<commit_message>
quebrando classes e mudando nomes
</commit_message>
<xml_diff>
--- a/meu prompt de verificacao.docx
+++ b/meu prompt de verificacao.docx
@@ -262,11 +262,19 @@
       </w:r>
       <w:proofErr w:type="spellStart"/>
       <w:r>
-        <w:t>Repository</w:t>
-      </w:r>
-      <w:proofErr w:type="spellEnd"/>
-      <w:r>
-        <w:t xml:space="preserve"> deve ter ≥1 app </w:t>
+        <w:t>repository</w:t>
+      </w:r>
+      <w:proofErr w:type="spellEnd"/>
+      <w:r>
+        <w:t xml:space="preserve"> de </w:t>
+      </w:r>
+      <w:proofErr w:type="spellStart"/>
+      <w:r>
+        <w:t>aggregate</w:t>
+      </w:r>
+      <w:proofErr w:type="spellEnd"/>
+      <w:r>
+        <w:t xml:space="preserve"> root deve ter ≥1 app </w:t>
       </w:r>
       <w:proofErr w:type="spellStart"/>
       <w:r>
@@ -274,7 +282,39 @@
       </w:r>
       <w:proofErr w:type="spellEnd"/>
       <w:r>
-        <w:t xml:space="preserve"> que usa; e todo app </w:t>
+        <w:t xml:space="preserve"> dono do fluxo; </w:t>
+      </w:r>
+      <w:proofErr w:type="spellStart"/>
+      <w:r>
+        <w:t>repositories</w:t>
+      </w:r>
+      <w:proofErr w:type="spellEnd"/>
+      <w:r>
+        <w:t xml:space="preserve"> de entidades filhas podem existir como suporte interno, sem </w:t>
+      </w:r>
+      <w:proofErr w:type="spellStart"/>
+      <w:r>
+        <w:t>service</w:t>
+      </w:r>
+      <w:proofErr w:type="spellEnd"/>
+      <w:r>
+        <w:t>/</w:t>
+      </w:r>
+      <w:proofErr w:type="spellStart"/>
+      <w:r>
+        <w:t>controller</w:t>
+      </w:r>
+      <w:proofErr w:type="spellEnd"/>
+      <w:r>
+        <w:t xml:space="preserve"> próprio, desde que o acesso seja encapsulado pelo </w:t>
+      </w:r>
+      <w:proofErr w:type="spellStart"/>
+      <w:r>
+        <w:t>aggregate</w:t>
+      </w:r>
+      <w:proofErr w:type="spellEnd"/>
+      <w:r>
+        <w:t xml:space="preserve"> root; e todo app </w:t>
       </w:r>
       <w:proofErr w:type="spellStart"/>
       <w:r>
@@ -1714,6 +1754,60 @@
           <w:b/>
           <w:bCs/>
         </w:rPr>
+        <w:t xml:space="preserve">35) Tem </w:t>
+      </w:r>
+      <w:proofErr w:type="gramStart"/>
+      <w:r>
+        <w:rPr>
+          <w:b/>
+          <w:bCs/>
+        </w:rPr>
+        <w:t xml:space="preserve">classes </w:t>
+      </w:r>
+      <w:r>
+        <w:rPr>
+          <w:b/>
+          <w:bCs/>
+        </w:rPr>
+        <w:t> </w:t>
+      </w:r>
+      <w:proofErr w:type="spellStart"/>
+      <w:r>
+        <w:rPr>
+          <w:b/>
+          <w:bCs/>
+        </w:rPr>
+        <w:t>stub</w:t>
+      </w:r>
+      <w:proofErr w:type="spellEnd"/>
+      <w:proofErr w:type="gramEnd"/>
+      <w:r>
+        <w:rPr>
+          <w:b/>
+          <w:bCs/>
+        </w:rPr>
+        <w:t> (esqueletos/incompletas) no projeto</w:t>
+      </w:r>
+      <w:r>
+        <w:rPr>
+          <w:b/>
+          <w:bCs/>
+        </w:rPr>
+        <w:t>?</w:t>
+      </w:r>
+    </w:p>
+    <w:p>
+      <w:pPr>
+        <w:rPr>
+          <w:b/>
+          <w:bCs/>
+        </w:rPr>
+      </w:pPr>
+      <w:r>
+        <w:rPr>
+          <w:b/>
+          <w:bCs/>
+        </w:rPr>
         <w:t>3</w:t>
       </w:r>
       <w:r>
@@ -1721,7 +1815,7 @@
           <w:b/>
           <w:bCs/>
         </w:rPr>
-        <w:t>5</w:t>
+        <w:t>6</w:t>
       </w:r>
       <w:r>
         <w:rPr>
@@ -1750,7 +1844,7 @@
           <w:b/>
           <w:bCs/>
         </w:rPr>
-        <w:t>6</w:t>
+        <w:t>7</w:t>
       </w:r>
       <w:r>
         <w:rPr>
@@ -1791,7 +1885,10 @@
         <w:t>3</w:t>
       </w:r>
       <w:r>
-        <w:t>7)</w:t>
+        <w:t>8</w:t>
+      </w:r>
+      <w:r>
+        <w:t>)</w:t>
       </w:r>
       <w:r>
         <w:t xml:space="preserve"> </w:t>
@@ -1860,7 +1957,7 @@
         <w:t>3</w:t>
       </w:r>
       <w:r>
-        <w:t>8</w:t>
+        <w:t>9</w:t>
       </w:r>
       <w:r>
         <w:t xml:space="preserve">) Todas as </w:t>
@@ -1898,14 +1995,6 @@
         <w:t xml:space="preserve"> deveria ficar em outra?</w:t>
       </w:r>
     </w:p>
-    <w:p/>
-    <w:p>
-      <w:r>
-        <w:t>SUBIR O PROJETO E COLAR O LOG DE SUBIDA NO CHAT PARA ANALISE</w:t>
-      </w:r>
-    </w:p>
-    <w:p/>
-    <w:p/>
     <w:p/>
     <w:p>
       <w:r>
@@ -7053,7 +7142,6 @@
   <w:style w:type="character" w:default="1" w:styleId="Fontepargpadro">
     <w:name w:val="Default Paragraph Font"/>
     <w:uiPriority w:val="1"/>
-    <w:semiHidden/>
     <w:unhideWhenUsed/>
   </w:style>
   <w:style w:type="table" w:default="1" w:styleId="Tabelanormal">

</xml_diff>

<commit_message>
fazendo ajuste de naming
</commit_message>
<xml_diff>
--- a/meu prompt de verificacao.docx
+++ b/meu prompt de verificacao.docx
@@ -1995,6 +1995,10 @@
         <w:t xml:space="preserve"> deveria ficar em outra?</w:t>
       </w:r>
     </w:p>
+    <w:p/>
+    <w:p/>
+    <w:p/>
+    <w:p/>
     <w:p/>
     <w:p>
       <w:r>
@@ -7142,6 +7146,7 @@
   <w:style w:type="character" w:default="1" w:styleId="Fontepargpadro">
     <w:name w:val="Default Paragraph Font"/>
     <w:uiPriority w:val="1"/>
+    <w:semiHidden/>
     <w:unhideWhenUsed/>
   </w:style>
   <w:style w:type="table" w:default="1" w:styleId="Tabelanormal">

</xml_diff>